<commit_message>
ADEP Klasik Word sablonu: teknik hatalar, celiskiler ve yazim hatalari duzeltildi
125 kN, 9 m/sn, halon, karbon tetraklorur, mulga tuzuk dili, 155, TEDAS,
Sivil Savunma; deprem disari kosma, elektrik akim kesilmeden dokunma,
platform korkuluguna cikma, aski sonrasi oturtma celiskileri; renk kodlari;
KTK Md.81 maddi hasarli kaza; ~45 yazim hatasi. Firma yama alanlari
(unvan, adres, SGK, tarih, uzman, acil durum listesi) korunur.

Co-Authored-By: Claude Opus 5.5 <noreply@anthropic.com>
</commit_message>
<xml_diff>
--- a/resources/belge/acil-durum-plani-sablonu.docx
+++ b/resources/belge/acil-durum-plani-sablonu.docx
@@ -244,7 +244,7 @@
           <w:sz w:val="24"/>
           <w:szCs w:val="24"/>
         </w:rPr>
-        <w:t>OLDUKTAN SONRA; En Kısa Sürede Eki Hale Gelmek İçin</w:t>
+        <w:t>OLDUKTAN SONRA; En Kısa Sürede Eski Hale Gelmek İçin</w:t>
       </w:r>
     </w:p>
     <w:p>
@@ -350,7 +350,7 @@
           <w:sz w:val="24"/>
           <w:szCs w:val="24"/>
         </w:rPr>
-        <w:t xml:space="preserve">İşyerinde veya yakın çevresinde, belirlenmiş olan acil durumları etkileyebilecek veya yeni acil durumların ortaya çıkmasına neden olacak değişikliklerin meydana gelmesi halinde acil durum planı tamamen veya kısmen yenilenir. Tehlike sınıfına göre çok tehlikeli işyerlerinde 2, tehlikeli işyerlerinde 4 ve az tehlikeli işyerlerinde 6 yılda bir yenilenir. Mevcut </w:t>
+        <w:t xml:space="preserve">İşyerinde veya yakın çevresinde, belirlenmiş olan acil durumları etkileyebilecek veya yeni acil durumların ortaya çıkmasına neden olacak değişikliklerin meydana gelmesi halinde acil durum planı tamamen veya kısmen yenilenir. Tehlike sınıfına göre çok tehlikeli işyerlerinde 2, tehlikeli işyerlerinde 4 ve az tehlikeli işyerlerinde 6 yılda bir yenilenir. Bu planın yenilenme süresi, işyeri bilgilerinde belirtilen tehlike sınıfına göre uygulanır.</w:t>
       </w:r>
       <w:r>
         <w:rPr>
@@ -359,7 +359,7 @@
           <w:sz w:val="24"/>
           <w:szCs w:val="24"/>
         </w:rPr>
-        <w:t>inşaat</w:t>
+        <w:t/>
       </w:r>
       <w:r>
         <w:rPr>
@@ -368,7 +368,7 @@
           <w:sz w:val="24"/>
           <w:szCs w:val="24"/>
         </w:rPr>
-        <w:t xml:space="preserve">  çok tehlikeli sınıfta olduğundan 2 yılda bir yenilenmesi gerekmektedir.</w:t>
+        <w:t xml:space="preserve"/>
       </w:r>
     </w:p>
     <w:p>
@@ -388,7 +388,7 @@
           <w:sz w:val="24"/>
           <w:szCs w:val="24"/>
         </w:rPr>
-        <w:t>İşverence acil durumların meydana gelmesi halinde söndürme, kurtarma, koruma, ilk yardım ve  gibi uygulanması gereken acil durum müdahale yöntemleri bel</w:t>
+        <w:t>İşverence acil durumların meydana gelmesi halinde söndürme, kurtarma, koruma, ilk yardım ve tahliye gibi uygulanması gereken acil durum müdahale yöntemleri bel</w:t>
       </w:r>
       <w:r>
         <w:rPr>
@@ -1548,7 +1548,7 @@
           <w:sz w:val="24"/>
           <w:szCs w:val="24"/>
         </w:rPr>
-        <w:t>Acil durum sırasında bilinçli davranabilmek, kayıpları en az düzeyde tutmak, güvenliği artırmak için ciddi önlemler almak gereklidir. Bunun için de, riskler gerçekleşmeden önce bazı çalışmalar yapılmalıdır.</w:t>
+        <w:t/>
       </w:r>
     </w:p>
     <w:p>
@@ -1737,7 +1737,7 @@
           <w:szCs w:val="24"/>
         </w:rPr>
         <w:tab/>
-        <w:t>İş güvenliği ve sağlık bilgilendirme işaretleri, genel güvenlik ve sağlık için YEŞİL renkli levhalar,</w:t>
+        <w:t>Acil çıkış, ilkyardım ve kurtarma işaretleri için YEŞİL renkli levhalar,</w:t>
       </w:r>
     </w:p>
     <w:p>
@@ -1767,7 +1767,7 @@
           <w:szCs w:val="24"/>
         </w:rPr>
         <w:tab/>
-        <w:t>Bilgilendirme, dikkat ve yasak işaretleri vb. için MAVİ renkli uyarı ve bilgi levhaları,</w:t>
+        <w:t>Zorunluluk (emredici) işaretleri için MAVİ renkli levhalar,</w:t>
       </w:r>
     </w:p>
     <w:p>
@@ -2072,7 +2072,7 @@
           <w:sz w:val="24"/>
           <w:szCs w:val="24"/>
         </w:rPr>
-        <w:t>Seyyar yangın söndürme cihazları, en az 6 ayda bir defa kontrol edilecek ve kontrol tarihleri cihazlar üzerine yazılacaktır. Köpüklü tip (sodyum bikarbonat-asitli) yangın söndürme cihazları, en az senede 1 defa tamamen boşaltılıp yeniden doldurulacaktır. Karbondioksitli, bikarbonat tozlu, karbon tetra-klorürlü ve benzeri kimyasal maddeli yangın söndürme cihazları kullanımdan sonra derhal yeniden doldurulacaktır.</w:t>
+        <w:t>Seyyar yangın söndürme cihazları, en az 6 ayda bir defa kontrol edilecek ve kontrol tarihleri cihazlar üzerine yazılacaktır. Söndürücülerin yılda bir kez yetkili serviste bakımı yaptırılacak, kullanılan söndürücüler derhal yeniden doldurulacaktır.</w:t>
       </w:r>
     </w:p>
     <w:p>
@@ -2125,7 +2125,7 @@
           <w:sz w:val="24"/>
           <w:szCs w:val="24"/>
         </w:rPr>
-        <w:t>Basınçlı kapları kontrol ve deneyleri, ehliyetli hükümet veya mahalli idarelerce kabul edilen teknik elemanlar tarafından, imalinin bitiminden sonra ve monte edilip kullanılmaya başlamadan önce veya yapılan değişiklik ve büyük onarımlardan sonra, en az 3 ay kullanılmayıp yeniden servise girmeleri halinde ise tekrar kullanılmaya başlamadan önce ve herhalde periyodik olarak yılda 1 defa yapılır. Kontrol ve deney sonuçları düzenlenecek bir raporda belirtilip, bu raporlar işyerlerinde saklanır.</w:t>
+        <w:t>Basınçlı kaplar ilk kullanımdan önce, büyük onarım veya değişiklikten sonra ve yılda en az bir kez, İş Ekipmanlarının Kullanımında Sağlık ve Güvenlik Şartları Yönetmeliği’ne göre yetkili kişiye kontrol ettirilir. Kontrol ve deney sonuçları düzenlenecek bir raporda belirtilip, bu raporlar işyerlerinde saklanır.</w:t>
       </w:r>
     </w:p>
     <w:p>
@@ -2231,7 +2231,7 @@
           <w:sz w:val="24"/>
           <w:szCs w:val="24"/>
         </w:rPr>
-        <w:t>Kompresörlerin güvenlikli çalışmalarını sağlamak üzere, kompresörlerin montajından sonra ve çalıştırılmasından önce, kompresörler üzerinde yapılacak değişiklik ve büyük onarımlardan sonra periyodik olarak yılda 1 kontrol ve deneyleri, ehliyeti hükümet veya mahalli idarelerce kabul edilen teknik elemanlar tarafından yapılacak ve sonuçları sicil kartına veya deftere işlenecektir.</w:t>
+        <w:t>Kompresörlerin güvenlikli çalışmalarını sağlamak üzere, kompresörlerin montajından sonra ve çalıştırılmasından önce, kompresörler üzerinde yapılacak değişiklik ve büyük onarımlardan sonra periyodik olarak yılda 1 kontrol ve deneyleri, İş Ekipmanlarının Kullanımında Sağlık ve Güvenlik Şartları Yönetmeliği’ne göre yetkili kişilerce yapılacak ve sonuçları sicil kartına veya deftere işlenecektir.</w:t>
       </w:r>
     </w:p>
     <w:p>
@@ -2566,7 +2566,7 @@
           <w:sz w:val="24"/>
           <w:szCs w:val="24"/>
         </w:rPr>
-        <w:t xml:space="preserve"> bölgesinde ot mücadelesi düzenli olarak sürdürülür. Anız yangınlarına önlem için kritik noktalar geniş şekilde sürdürülür.</w:t>
+        <w:t xml:space="preserve"> bölgesinde ot mücadelesi düzenli olarak sürdürülür. Anız yangınlarına karşı kritik noktalarda geniş şeritler halinde ot temizliği yapılır.</w:t>
       </w:r>
     </w:p>
     <w:p>
@@ -2678,7 +2678,7 @@
           <w:sz w:val="24"/>
           <w:szCs w:val="24"/>
         </w:rPr>
-        <w:t xml:space="preserve"> bakım ve kontrollerle çalışılır durumda tutulur.</w:t>
+        <w:t xml:space="preserve"> bakım ve kontrollerle çalışır durumda tutulur.</w:t>
       </w:r>
     </w:p>
     <w:p>
@@ -2736,7 +2736,7 @@
           <w:sz w:val="24"/>
           <w:szCs w:val="24"/>
         </w:rPr>
-        <w:t>. İnşaat</w:t>
+        <w:t>. İnşaat alanı</w:t>
       </w:r>
       <w:r>
         <w:rPr>
@@ -2745,7 +2745,7 @@
           <w:sz w:val="24"/>
           <w:szCs w:val="24"/>
         </w:rPr>
-        <w:t xml:space="preserve">alanı </w:t>
+        <w:t xml:space="preserve"> </w:t>
       </w:r>
       <w:r>
         <w:rPr>
@@ -4821,7 +4821,7 @@
                 <w:sz w:val="24"/>
                 <w:szCs w:val="24"/>
               </w:rPr>
-              <w:t>YANGIN DURUMUNDA YAPILMASI GERKENLER</w:t>
+              <w:t>YANGIN DURUMUNDA YAPILMASI GEREKENLER</w:t>
             </w:r>
           </w:p>
           <w:p>
@@ -5777,7 +5777,7 @@
                 <w:sz w:val="24"/>
                 <w:szCs w:val="24"/>
               </w:rPr>
-              <w:t>öndürme ekibi , İlk yardım ekibi, Kurtarma ekibi ve Koruma ekibi oluşturulmalı ve bu ekiplere gerekli eğitimler verilmelidir./ aldırılmalıdır.</w:t>
+              <w:t>öndürme ekibi , İlk yardım ekibi, Kurtarma ekibi ve Koruma ekibi oluşturulmalı ve bu ekiplere gerekli eğitimler verilmeli veya aldırılmalıdır.</w:t>
             </w:r>
           </w:p>
           <w:p>
@@ -5802,16 +5802,16 @@
                 <w:sz w:val="24"/>
                 <w:szCs w:val="24"/>
               </w:rPr>
-              <w:t>En az yılda bir kez</w:t>
-            </w:r>
-            <w:r>
-              <w:rPr>
-                <w:rFonts w:ascii="Times New Roman" w:hAnsi="Times New Roman" w:cs="Times New Roman"/>
-                <w:color w:val="000000" w:themeColor="text1"/>
-                <w:sz w:val="24"/>
-                <w:szCs w:val="24"/>
-              </w:rPr>
-              <w:t>yangın tahliye ve kurtarma tatbikatları yaptırılmalıdır.</w:t>
+              <w:t>En az yılda bir kez yangın</w:t>
+            </w:r>
+            <w:r>
+              <w:rPr>
+                <w:rFonts w:ascii="Times New Roman" w:hAnsi="Times New Roman" w:cs="Times New Roman"/>
+                <w:color w:val="000000" w:themeColor="text1"/>
+                <w:sz w:val="24"/>
+                <w:szCs w:val="24"/>
+              </w:rPr>
+              <w:t> tahliye ve kurtarma tatbikatları yaptırılmalıdır.</w:t>
             </w:r>
           </w:p>
           <w:p>
@@ -6044,43 +6044,43 @@
                 <w:sz w:val="24"/>
                 <w:szCs w:val="24"/>
               </w:rPr>
-              <w:t xml:space="preserve">Firma </w:t>
-            </w:r>
-            <w:r>
-              <w:rPr>
-                <w:rFonts w:ascii="Times New Roman" w:hAnsi="Times New Roman" w:cs="Times New Roman"/>
-                <w:color w:val="000000" w:themeColor="text1"/>
-                <w:sz w:val="24"/>
-                <w:szCs w:val="24"/>
-              </w:rPr>
-              <w:t xml:space="preserve">(İnşaat hariç) </w:t>
-            </w:r>
-            <w:r>
-              <w:rPr>
-                <w:rFonts w:ascii="Times New Roman" w:hAnsi="Times New Roman" w:cs="Times New Roman"/>
-                <w:color w:val="000000" w:themeColor="text1"/>
-                <w:sz w:val="24"/>
-                <w:szCs w:val="24"/>
-              </w:rPr>
-              <w:t xml:space="preserve">içerisinde her </w:t>
-            </w:r>
-            <w:r>
-              <w:rPr>
-                <w:rFonts w:ascii="Times New Roman" w:hAnsi="Times New Roman" w:cs="Times New Roman"/>
-                <w:color w:val="000000" w:themeColor="text1"/>
-                <w:sz w:val="24"/>
-                <w:szCs w:val="24"/>
-              </w:rPr>
-              <w:t xml:space="preserve">mümkün olan her </w:t>
-            </w:r>
-            <w:r>
-              <w:rPr>
-                <w:rFonts w:ascii="Times New Roman" w:hAnsi="Times New Roman" w:cs="Times New Roman"/>
-                <w:color w:val="000000" w:themeColor="text1"/>
-                <w:sz w:val="24"/>
-                <w:szCs w:val="24"/>
-              </w:rPr>
-              <w:t>bölüme springer sulu sistem kurulmalı yangının büyümeden önüne geçilmesi sağlanmalıdır.</w:t>
+              <w:t xml:space="preserve">Firma (inşaat hariç) içinde mümkün olan her bölüme sprinkler (otomatik sulu söndürme) sistemi kurulmalı, yangının büyümeden önüne geçilmesi sağlanmalıdır.</w:t>
+            </w:r>
+            <w:r>
+              <w:rPr>
+                <w:rFonts w:ascii="Times New Roman" w:hAnsi="Times New Roman" w:cs="Times New Roman"/>
+                <w:color w:val="000000" w:themeColor="text1"/>
+                <w:sz w:val="24"/>
+                <w:szCs w:val="24"/>
+              </w:rPr>
+              <w:t xml:space="preserve"/>
+            </w:r>
+            <w:r>
+              <w:rPr>
+                <w:rFonts w:ascii="Times New Roman" w:hAnsi="Times New Roman" w:cs="Times New Roman"/>
+                <w:color w:val="000000" w:themeColor="text1"/>
+                <w:sz w:val="24"/>
+                <w:szCs w:val="24"/>
+              </w:rPr>
+              <w:t xml:space="preserve"/>
+            </w:r>
+            <w:r>
+              <w:rPr>
+                <w:rFonts w:ascii="Times New Roman" w:hAnsi="Times New Roman" w:cs="Times New Roman"/>
+                <w:color w:val="000000" w:themeColor="text1"/>
+                <w:sz w:val="24"/>
+                <w:szCs w:val="24"/>
+              </w:rPr>
+              <w:t xml:space="preserve"/>
+            </w:r>
+            <w:r>
+              <w:rPr>
+                <w:rFonts w:ascii="Times New Roman" w:hAnsi="Times New Roman" w:cs="Times New Roman"/>
+                <w:color w:val="000000" w:themeColor="text1"/>
+                <w:sz w:val="24"/>
+                <w:szCs w:val="24"/>
+              </w:rPr>
+              <w:t/>
             </w:r>
           </w:p>
           <w:p>
@@ -7027,20 +7027,20 @@
                     <w:rPr>
                       <w:rFonts w:ascii="Arial" w:hAnsi="Arial" w:cs="Arial"/>
                     </w:rPr>
-                    <w:t>ABC ve BC tozlu, halon gazlı, CO</w:t>
+                    <w:t>ABC ve BC tozlu, CO2 ve köpüklü söndürücü</w:t>
                   </w:r>
                   <w:r>
                     <w:rPr>
                       <w:rFonts w:ascii="Arial" w:hAnsi="Arial" w:cs="Arial"/>
                       <w:vertAlign w:val="subscript"/>
                     </w:rPr>
-                    <w:t>2</w:t>
+                    <w:t/>
                   </w:r>
                   <w:r>
                     <w:rPr>
                       <w:rFonts w:ascii="Arial" w:hAnsi="Arial" w:cs="Arial"/>
                     </w:rPr>
-                    <w:t xml:space="preserve"> ve köpüklü söndürücü</w:t>
+                    <w:t xml:space="preserve"/>
                   </w:r>
                 </w:p>
               </w:tc>
@@ -7067,20 +7067,20 @@
                     <w:rPr>
                       <w:rFonts w:ascii="Arial" w:hAnsi="Arial" w:cs="Arial"/>
                     </w:rPr>
-                    <w:t>ABC ve BC tozlu, halon ve CO</w:t>
+                    <w:t>ABC ve BC tozlu söndürücü (önce gaz akışı kesilir)</w:t>
                   </w:r>
                   <w:r>
                     <w:rPr>
                       <w:rFonts w:ascii="Arial" w:hAnsi="Arial" w:cs="Arial"/>
                       <w:vertAlign w:val="subscript"/>
                     </w:rPr>
-                    <w:t>2</w:t>
+                    <w:t/>
                   </w:r>
                   <w:r>
                     <w:rPr>
                       <w:rFonts w:ascii="Arial" w:hAnsi="Arial" w:cs="Arial"/>
                     </w:rPr>
-                    <w:t xml:space="preserve"> gazlı söndürücü</w:t>
+                    <w:t xml:space="preserve"/>
                   </w:r>
                 </w:p>
               </w:tc>
@@ -7134,7 +7134,7 @@
                     <w:rPr>
                       <w:rFonts w:ascii="Arial" w:hAnsi="Arial" w:cs="Arial"/>
                     </w:rPr>
-                    <w:t>ABC ve B tozlu, halon gazlı söndürücü</w:t>
+                    <w:t>CO2 ve ABC tozlu söndürücü</w:t>
                   </w:r>
                 </w:p>
               </w:tc>
@@ -7468,7 +7468,7 @@
                 <w:u w:val="single"/>
               </w:rPr>
               <w:lastRenderedPageBreak/>
-              <w:t>Not: B sınıfı sıvı yangınlarında kesinlikle su kullanılmaz. Su yangının seyrelmesine ve dolayısıyla etrafa yayılmasına sebep olur.</w:t>
+              <w:t>Not: B sınıfı sıvı yangınlarında kesinlikle su kullanılmaz. Su, yanan sıvının sıçramasına ve yangının etrafa yayılmasına sebep olur.</w:t>
             </w:r>
           </w:p>
           <w:p>
@@ -7558,7 +7558,7 @@
               </w:numPr>
             </w:pPr>
             <w:r>
-              <w:t xml:space="preserve">Miktarı 50 ltyi aşan çözücüler (solventler) kimyasal dökülmelerine karşın döküntülerin birikeceği tepsiler bulunan metal dolaplarda ve/veya özel olarak hazırlanmış ya da amaca uygun olarak yeniden düzenlenmiş odalarda saklanmalıdır. </w:t>
+              <w:t xml:space="preserve">Miktarı 50 litreyi aşan çözücüler (solventler) kimyasal dökülmelerine karşı döküntülerin birikeceği tepsiler bulunan metal dolaplarda ve/veya özel olarak hazırlanmış ya da amaca uygun olarak yeniden düzenlenmiş odalarda saklanmalıdır. </w:t>
             </w:r>
           </w:p>
           <w:p>
@@ -7886,7 +7886,7 @@
               </w:numPr>
             </w:pPr>
             <w:r>
-              <w:t>Çabuk parlayıcı ve sıcağa karşı malzemeler sık sık kontrol edilir.</w:t>
+              <w:t>Çabuk parlayıcı ve sıcağa duyarlı malzemeler sık sık kontrol edilir.</w:t>
             </w:r>
             <w:r>
               <w:tab/>
@@ -7978,7 +7978,7 @@
               </w:numPr>
             </w:pPr>
             <w:r>
-              <w:t>Çevredeki yabani otlar, kağıt, bez, parçası gibi yanıcı atıklar temizlenir, kesilen otlar yakılmaz ve saha dışına çıkarılır.</w:t>
+              <w:t>Çevredeki yabani otlar, kağıt, bez parçası gibi yanıcı atıklar temizlenir, kesilen otlar yakılmaz ve saha dışına çıkarılır.</w:t>
             </w:r>
             <w:r>
               <w:tab/>
@@ -8690,7 +8690,7 @@
                       <w:rFonts w:ascii="Arial" w:hAnsi="Arial" w:cs="Arial"/>
                       <w:bCs/>
                     </w:rPr>
-                    <w:t>Eğer yangın kendi imkanlarınızla söndüremeyecek kadar büyük ise; en kısa ve doğru olarak adrese, yangın cinsini (elektrik, bina, akaryakıt vb) belirtmek suretiyle itfaiyeye haber veriniz.</w:t>
+                    <w:t>Eğer yangın kendi imkanlarınızla söndüremeyecek kadar büyük ise; en kısa ve doğru olarak adresi, yangın cinsini (elektrik, bina, akaryakıt vb) belirtmek suretiyle itfaiyeye haber veriniz.</w:t>
                   </w:r>
                 </w:p>
               </w:tc>
@@ -9589,7 +9589,7 @@
                 <w:sz w:val="24"/>
                 <w:szCs w:val="24"/>
               </w:rPr>
-              <w:t>Deprem olduğunu anladığınızda bina içerisinde bulunuyorsanız ve çıkışa çok yakın bir noktada iseniz dışarı çıkarak Acil Toplanma Bölgesine gidin,</w:t>
+              <w:t>Deprem sırasında bina içindeyseniz dışarı koşmaya çalışmayın; sarsıntı bitince kaçış yollarını kullanarak Acil Toplanma Bölgesine gidin,</w:t>
             </w:r>
           </w:p>
           <w:p>
@@ -9613,7 +9613,7 @@
                 <w:sz w:val="24"/>
                 <w:szCs w:val="24"/>
               </w:rPr>
-              <w:t>Dışarı çıkamıyorsanız, sallantı tamamlanıncaya kadar;</w:t>
+              <w:t>Sarsıntı bitene kadar;</w:t>
             </w:r>
           </w:p>
           <w:p>
@@ -9718,7 +9718,7 @@
                 <w:sz w:val="24"/>
                 <w:szCs w:val="24"/>
               </w:rPr>
-              <w:t xml:space="preserve">        -Bulunduğunuz noktanın malzeme düşme tehlikesi uzak yerlerden olmasına dikkat edin,</w:t>
+              <w:t xml:space="preserve">        -Bulunduğunuz noktanın malzeme düşme tehlikesinden uzak yerlerden olmasına dikkat edin,</w:t>
             </w:r>
           </w:p>
           <w:p>
@@ -9790,7 +9790,7 @@
                 <w:sz w:val="24"/>
                 <w:szCs w:val="24"/>
               </w:rPr>
-              <w:t>Deprem sırasında mümkünse,</w:t>
+              <w:t>Sarsıntı biter bitmez, güvenliyse,</w:t>
             </w:r>
           </w:p>
           <w:p>
@@ -9838,7 +9838,7 @@
                 <w:sz w:val="24"/>
                 <w:szCs w:val="24"/>
               </w:rPr>
-              <w:t>Basınçlı gazlara ait tüplerin vanalarını kapatılmalı,</w:t>
+              <w:t>Basınçlı gazlara ait tüplerin vanaları kapatılmalı,</w:t>
             </w:r>
           </w:p>
           <w:p>
@@ -10099,7 +10099,7 @@
                 <w:color w:val="000000" w:themeColor="text1"/>
                 <w:lang w:eastAsia="en-US"/>
               </w:rPr>
-              <w:t xml:space="preserve">Pencerelerden, binalardan, elektrik tellerinden ve direklerden uzak durarak, en yakın toplanma bölgesine gitmeye çalışın. </w:t>
+              <w:t xml:space="preserve">Pencerelerden, binalardan, elektrik tellerinden ve direklerden uzak durarak, sarsıntı bitince en yakın toplanma bölgesine gidin. </w:t>
             </w:r>
           </w:p>
           <w:p>
@@ -10331,7 +10331,7 @@
                 <w:color w:val="000000" w:themeColor="text1"/>
                 <w:lang w:eastAsia="en-US"/>
               </w:rPr>
-              <w:t>Her nerede olursanız olun, zeminin şiddetle hareket etmesi olasılığına hazır olun. Örtünün, kendinizi sağlam bir nesnenin korumasına alın. Bunu yapamıyorsanız, yere çökün, başınızı ve yüzünüzü koruyacak biçimde kapanın. İlk sarsıntıyı izleyecek diğer sarsıntılara da hazır olun.</w:t>
+              <w:t>Her nerede olursanız olun, zeminin şiddetle hareket etmesi olasılığına hazır olun. Kendinizi sağlam bir nesnenin korumasına alın. Bunu yapamıyorsanız, yere çökün, başınızı ve yüzünüzü koruyacak biçimde kapanın. İlk sarsıntıyı izleyecek diğer sarsıntılara da hazır olun.</w:t>
             </w:r>
           </w:p>
           <w:p>
@@ -10606,7 +10606,7 @@
                 <w:sz w:val="24"/>
                 <w:szCs w:val="24"/>
               </w:rPr>
-              <w:t>Gerekirse Sivil Savunma Müdürlüğünden yardım istenmeli,</w:t>
+              <w:t>Gerekirse 112 aranarak AFAD’dan yardım istenmeli,</w:t>
             </w:r>
           </w:p>
           <w:p>
@@ -10633,7 +10633,7 @@
                 <w:sz w:val="24"/>
                 <w:szCs w:val="24"/>
               </w:rPr>
-              <w:t>Yaralı varsa ilk müdahale yapılmalı, gerekiyorsa yaralı hastaneler aranıp doluluk oranı sorularak müsait olan ve hasar görmemiş en yakın hastaneye götürülmeli,</w:t>
+              <w:t>Yaralı varsa ilk müdahale yapılmalı, 112’ye haber verilerek yönlendirmesine göre hastaneye sevk edilmeli,</w:t>
             </w:r>
           </w:p>
           <w:p>
@@ -11041,7 +11041,7 @@
                 <w:sz w:val="24"/>
                 <w:szCs w:val="24"/>
               </w:rPr>
-              <w:t>İtfaiye gelene kadar inşaatta bulunan fırça vb. malzemeyle suyun basması veya temizlenmesi işi yapılır.</w:t>
+              <w:t>İtfaiye gelene kadar inşaatta bulunan fırça vb. malzemeyle suyun dışarı atılması ve temizlenmesi işi yapılır.</w:t>
             </w:r>
           </w:p>
           <w:p>
@@ -11474,7 +11474,7 @@
                 <w:sz w:val="24"/>
                 <w:szCs w:val="24"/>
               </w:rPr>
-              <w:t>5. Tahliye planlarının inşaata</w:t>
+              <w:t>6. Tahliye planlarının inşaata</w:t>
             </w:r>
             <w:r>
               <w:rPr>
@@ -11710,7 +11710,7 @@
                 <w:sz w:val="24"/>
                 <w:szCs w:val="24"/>
               </w:rPr>
-              <w:t>Eğer saldırgan silahlı ise müdahale edilmez polisin gelmesi beklenir. Saldırgan oyalanmaya veya nereye gittiği takip edilmeye çalışılır. Araçlı ise aracın plakası alınır.</w:t>
+              <w:t>Eğer saldırgan silahlı ise müdahale edilmez polisin gelmesi beklenir. Saldırganla tartışılmaz, takip edilmez; güvenli yerden görülebiliyorsa eşkâli ve kaçış yönü not edilir. Araçlı ise aracın plakası alınır.</w:t>
             </w:r>
           </w:p>
           <w:p>
@@ -11740,7 +11740,7 @@
                 <w:sz w:val="24"/>
                 <w:szCs w:val="24"/>
               </w:rPr>
-              <w:t>Eğer saldırgan silahsız ise yakalanmaya veya kaçması engellenmeye çalışılır.</w:t>
+              <w:t>Saldırgan silahsız görünse de müdahale güvenlik görevlilerine ve polise bırakılır; çalışanlar kendini tehlikeye atmaz.</w:t>
             </w:r>
           </w:p>
           <w:p>
@@ -11770,7 +11770,7 @@
                 <w:sz w:val="24"/>
                 <w:szCs w:val="24"/>
               </w:rPr>
-              <w:t>Saldırı bittikten sonra, saldırgan yakalanmaya çalışılırken, sabotaj sonucu çıkan acil duruma ekipler tarafından müdahale edilir. Gerekirse yardım istenir.</w:t>
+              <w:t>Saldırı bittikten sonra sabotaj sonucu çıkan acil duruma ekipler tarafından müdahale edilir. Gerekirse yardım istenir.</w:t>
             </w:r>
           </w:p>
           <w:p>
@@ -12068,7 +12068,7 @@
                 <w:sz w:val="24"/>
                 <w:szCs w:val="24"/>
               </w:rPr>
-              <w:t>Yüksekte çalışma yapılması gerektiği noktalarda, Toplu Koruma Önlemleri alınmalıdır.( 1.2 m yüksekliğinde 125 kN darbeye dayanabilecek korkuluk,  En 1263 standardında güvenlik ağları vb.)</w:t>
+              <w:t>Yüksekte çalışma yapılması gerektiği noktalarda, Toplu Koruma Önlemleri alınmalıdır.(ara korkuluğu ve topuk levhası bulunan, yeterli dayanımda en az 1,2 m yüksekliğinde korkuluk,  EN 1263 standardında güvenlik ağları vb.)</w:t>
             </w:r>
           </w:p>
           <w:p>
@@ -12111,7 +12111,7 @@
                 <w:sz w:val="24"/>
                 <w:szCs w:val="24"/>
               </w:rPr>
-              <w:t>, EN 355 Şok Emiciler, En 362 Çift Emniyet Kancası v</w:t>
+              <w:t>, EN 355 Şok Emiciler, EN 362 Çift Emniyet Kancası v</w:t>
             </w:r>
             <w:r>
               <w:rPr>
@@ -12129,7 +12129,7 @@
                 <w:sz w:val="24"/>
                 <w:szCs w:val="24"/>
               </w:rPr>
-              <w:t>, En 363 düşmeyi durdurucu sistemler kullanılmalıdır.</w:t>
+              <w:t>, EN 363 düşmeyi durdurucu sistemler kullanılmalıdır.</w:t>
             </w:r>
           </w:p>
           <w:p>
@@ -12154,16 +12154,16 @@
                 <w:sz w:val="24"/>
                 <w:szCs w:val="24"/>
               </w:rPr>
-              <w:t>Yüksekte çalışmalarda TS EN 795:1998;  TS EN 795/A1</w:t>
-            </w:r>
-            <w:r>
-              <w:rPr>
-                <w:rFonts w:ascii="Times New Roman" w:hAnsi="Times New Roman" w:cs="Times New Roman"/>
-                <w:color w:val="000000" w:themeColor="text1"/>
-                <w:sz w:val="24"/>
-                <w:szCs w:val="24"/>
-              </w:rPr>
-              <w:t>:2004 standardında yatay yaşam halatları, EN 353-1:2014 standardında dikey yaşam halatlarıkurulmalıdır. Yaşam hatlarına kesinlikle birden fazla personel bağlanmamalıdır.</w:t>
+              <w:t>Yüksekte çalışmalarda TS EN 795 standardında</w:t>
+            </w:r>
+            <w:r>
+              <w:rPr>
+                <w:rFonts w:ascii="Times New Roman" w:hAnsi="Times New Roman" w:cs="Times New Roman"/>
+                <w:color w:val="000000" w:themeColor="text1"/>
+                <w:sz w:val="24"/>
+                <w:szCs w:val="24"/>
+              </w:rPr>
+              <w:t> yatay yaşam halatları, EN 353-1:2014 standardında dikey yaşam halatları kurulmalıdır. Yaşam hatlarına üreticinin izin verdiğinden fazla personel bağlanmamalıdır.</w:t>
             </w:r>
           </w:p>
           <w:p>
@@ -12263,7 +12263,7 @@
                 <w:sz w:val="24"/>
                 <w:szCs w:val="24"/>
               </w:rPr>
-              <w:t>Yüksekte yapılacak çalışmalar mümkün olan en az kişi de yapılmalıdır.</w:t>
+              <w:t>Yüksekte yapılacak çalışmalar mümkün olan en az kişi ile yapılmalıdır.</w:t>
             </w:r>
           </w:p>
           <w:p>
@@ -12413,7 +12413,7 @@
                 <w:sz w:val="24"/>
                 <w:szCs w:val="24"/>
               </w:rPr>
-              <w:t>Balkon, asansör, çatı kenarları gibi alanlarda yapılan çalışmalarda kemerin halatı kısa tutulup, personelin boşluğu düşmesinin önüne geçilmelidir. Bu alanlarda kemerler bağlantı noktası duvara bağlantı noktası oluşturularak bu alanlara bağlanılmalıdır.</w:t>
+              <w:t>Balkon, asansör, çatı kenarları gibi alanlarda yapılan çalışmalarda kemerin halatı kısa tutulup, personelin boşluğa düşmesinin önüne geçilmelidir. Bu alanlarda kemerler bağlantı noktası duvara bağlantı noktası oluşturularak bu alanlara bağlanılmalıdır.</w:t>
             </w:r>
           </w:p>
           <w:p>
@@ -12488,7 +12488,7 @@
                 <w:sz w:val="24"/>
                 <w:szCs w:val="24"/>
               </w:rPr>
-              <w:t>Standartlara uymayan eski, deforme olmuş, yırtılmış,  halatlar kullanılmamalı bu tarz kişisel koruyucu donanımlar üretimden uzaklaştırılmalıdır.</w:t>
+              <w:t>Standartlara uymayan eski, deforme olmuş, yırtılmış,  halatlar kullanılmamalı bu tarz kişisel koruyucu donanımlar kullanımdan kaldırılmalıdır.</w:t>
             </w:r>
           </w:p>
           <w:p>
@@ -12539,7 +12539,7 @@
                 <w:sz w:val="24"/>
                 <w:szCs w:val="24"/>
               </w:rPr>
-              <w:t>Sepetin kapısı içeri doğru açılmalı, korkuluk yükseklikleri 120 cm olmalı ve herhangi bir noktadan gelebilecek 125 kN darbeye dayanabilecek sağlamlıkta olmalıdır.</w:t>
+              <w:t>Sepetin kapısı içeri doğru açılmalı, korkuluk yükseklikleri 120 cm olmalı ve üreticinin belirttiği dayanımda olmalıdır.</w:t>
             </w:r>
           </w:p>
           <w:p>
@@ -13026,7 +13026,7 @@
                 <w:lang w:eastAsia="en-US"/>
               </w:rPr>
               <w:lastRenderedPageBreak/>
-              <w:t>• Askıda kalan personelin çevredeki fiziksel engellere çarptığı düşünülerek boyun ateli takılmalıdır.</w:t>
+              <w:t>• Askıda kalan personelin çevredeki engellere çarpmış olabileceği düşünülerek boyun ateli takılmalıdır.</w:t>
             </w:r>
           </w:p>
           <w:p>
@@ -13046,7 +13046,7 @@
                 <w:color w:val="000000" w:themeColor="text1"/>
                 <w:lang w:eastAsia="en-US"/>
               </w:rPr>
-              <w:t>• Askıda kalan personel, eğitimli kişiler tarafından uygun kurtarma teknikleri ve ekipmanlar ile indirilmeli, sırt dik duracak şekilde bir yere yaslanmalı, ayaklar karın boşluğuna doğru kırılmalı ve açılmaması için perlon vb. malzeme ile sabitlenmelidir.</w:t>
+              <w:t>• Askıda kalan personel, eğitimli kişiler tarafından uygun kurtarma teknikleri ve ekipmanlar ile indirilmelidir. İndirilen kişiye ilkyardımcı güncel ilkyardım eğitimine ve 112 yönlendirmesine göre müdahale eder; omurga yaralanması şüphesinde gereksiz hareket ettirilmez.</w:t>
             </w:r>
           </w:p>
           <w:p>
@@ -13066,7 +13066,7 @@
                 <w:color w:val="000000" w:themeColor="text1"/>
                 <w:lang w:eastAsia="en-US"/>
               </w:rPr>
-              <w:t>• 5-10 dakika bekletildikten sonra kendisine gelmeyen kazazede (şok halinde bulunan) koma pozisyonunda sedyeye alınarak hastaneye tahliyesi sağlanır. </w:t>
+              <w:t>• Kendine gelmeyen kazazede beklenmeden 112 ile hastaneye ulaştırılır. </w:t>
             </w:r>
           </w:p>
         </w:tc>
@@ -13173,7 +13173,7 @@
                 <w:sz w:val="24"/>
                 <w:szCs w:val="24"/>
               </w:rPr>
-              <w:t xml:space="preserve">Elektrik akımının insan vücudundan geçmesiyle meydana gelen tehlikeli durumdur. Ortaya çıkan tahribat, çeşitli hususlara bağlıdır. Burada elektrik akımının gerilimi, şiddeti ve frekansı önemlidir. Bütün akımlar, vücut toprağa bağlı olduğu zaman daha tehlikeli olur. Halbuki lastik veya kauçuk tabanlı ayakkabı giymiş kişide akımların tesiri fazla tehlike arz etmez. Canlı dokunun elektrik ile teması; yaralanmaya yol açmayan sadece rahatsızlık veren geçici bir his duyusundan kalp-solunum durmasına kadar değişebilen etkilenme durumlarıyla karşımıza çıkmaktadır. </w:t>
+              <w:t xml:space="preserve">Elektrik akımının insan vücudundan geçmesiyle meydana gelen tehlikeli durumdur. Ortaya çıkan tahribat, çeşitli hususlara bağlıdır. Burada elektrik akımının gerilimi, şiddeti ve frekansı önemlidir. Bütün akımlar, vücut toprağa bağlı olduğu zaman daha tehlikeli olur. Lastik veya kauçuk tabanlı ayakkabı akımın etkisini azaltabilir ancak tek başına koruma sağlamaz. Canlı dokunun elektrik ile teması; yaralanmaya yol açmayan sadece rahatsızlık veren geçici bir his duyusundan kalp-solunum durmasına kadar değişebilen etkilenme durumlarıyla karşımıza çıkmaktadır. </w:t>
             </w:r>
           </w:p>
           <w:p>
@@ -13484,26 +13484,26 @@
                 <w:sz w:val="24"/>
                 <w:szCs w:val="24"/>
               </w:rPr>
-              <w:t>6. Enerji nakil hatları; TEDAŞ’a bilgi verilerek çalışma alanı sınırları içinde tehlike oluşturabilecek kısımların yalıtılması sağlanmalıdır.</w:t>
-            </w:r>
-          </w:p>
-          <w:p>
-            <w:pPr>
-              <w:rPr>
-                <w:rFonts w:ascii="Times New Roman" w:hAnsi="Times New Roman" w:cs="Times New Roman"/>
-                <w:color w:val="000000" w:themeColor="text1"/>
-                <w:sz w:val="24"/>
-                <w:szCs w:val="24"/>
-              </w:rPr>
-            </w:pPr>
-            <w:r>
-              <w:rPr>
-                <w:rFonts w:ascii="Times New Roman" w:hAnsi="Times New Roman" w:cs="Times New Roman"/>
-                <w:color w:val="000000" w:themeColor="text1"/>
-                <w:sz w:val="24"/>
-                <w:szCs w:val="24"/>
-              </w:rPr>
-              <w:t>7. Gerekli durumlarda; TEDAŞ’a bilgi verilerek enerji nakil tatlarının toprak altına alınması ya da çalışma alanından daha da uzaklaştırılması sağlanmalıdır.</w:t>
+              <w:t>6. Enerji nakil hatları; Elektrik dağıtım şirketine bilgi verilerek çalışma alanı sınırları içinde tehlike oluşturabilecek kısımların yalıtılması sağlanmalıdır.</w:t>
+            </w:r>
+          </w:p>
+          <w:p>
+            <w:pPr>
+              <w:rPr>
+                <w:rFonts w:ascii="Times New Roman" w:hAnsi="Times New Roman" w:cs="Times New Roman"/>
+                <w:color w:val="000000" w:themeColor="text1"/>
+                <w:sz w:val="24"/>
+                <w:szCs w:val="24"/>
+              </w:rPr>
+            </w:pPr>
+            <w:r>
+              <w:rPr>
+                <w:rFonts w:ascii="Times New Roman" w:hAnsi="Times New Roman" w:cs="Times New Roman"/>
+                <w:color w:val="000000" w:themeColor="text1"/>
+                <w:sz w:val="24"/>
+                <w:szCs w:val="24"/>
+              </w:rPr>
+              <w:t>7. Gerekli durumlarda; elektrik dağıtım şirketine bilgi verilerek enerji nakil hatlarının toprak altına alınması ya da çalışma alanından daha da uzaklaştırılması sağlanmalıdır.</w:t>
             </w:r>
           </w:p>
           <w:p>
@@ -13646,7 +13646,7 @@
                 <w:sz w:val="24"/>
                 <w:szCs w:val="24"/>
               </w:rPr>
-              <w:t xml:space="preserve">5. Hastayı giysilerinden çekerek bölgeden uzaklaştırınız. </w:t>
+              <w:t xml:space="preserve">5. Akım kesildikten sonra yaralıyı güvenli bölgeye alınız. </w:t>
             </w:r>
           </w:p>
           <w:p>
@@ -13694,7 +13694,7 @@
                 <w:sz w:val="24"/>
                 <w:szCs w:val="24"/>
               </w:rPr>
-              <w:t xml:space="preserve">7. Elektrik çarpan kişiye kalın lastik tabanlı ayakkabınız yoksa dokunmayınız. </w:t>
+              <w:t xml:space="preserve">7. Akım kesilmeden, lastik tabanlı ayakkabı giyiyor olsanız bile yaralıya dokunmayınız. </w:t>
             </w:r>
           </w:p>
           <w:p>
@@ -13788,7 +13788,7 @@
                 <w:sz w:val="24"/>
                 <w:szCs w:val="24"/>
               </w:rPr>
-              <w:t>11. Kazazedeyi en yakın hastaneye ulaştırınız.</w:t>
+              <w:t>11. Kazazede iyi görünse bile hastanede kontrol edilmesini sağlayınız.</w:t>
             </w:r>
           </w:p>
           <w:p>
@@ -14024,7 +14024,7 @@
                 <w:sz w:val="24"/>
                 <w:szCs w:val="24"/>
               </w:rPr>
-              <w:t xml:space="preserve"> Yüksek voltaj nedeniyle meydana gelen kazalarda ise mutlaka akım kesilmelidir. Resmi yetkililerden elektrik, izole edildiğini öğrenmeden kazazedeye yaklaşılmamalıdır. Akımının kesildiğini ve gerekiyorsa en az 18–20 metrelik bir güvenlik mesafesi aşılmamalı ve çevredekiler de yaklaştırılmamalıdır.</w:t>
+              <w:t xml:space="preserve"> Yüksek voltaj nedeniyle meydana gelen kazalarda ise mutlaka akım kesilmelidir. Elektriğin kesildiği yetkililerce bildirilmeden kazazedeye yaklaşılmamalı; o zamana kadar en az 18 metrelik güvenlik mesafesi korunmalı ve çevredekiler de yaklaştırılmamalıdır.</w:t>
             </w:r>
           </w:p>
         </w:tc>
@@ -15161,16 +15161,16 @@
                 <w:sz w:val="24"/>
                 <w:szCs w:val="24"/>
               </w:rPr>
-              <w:t>Acil durum10</w:t>
-            </w:r>
-            <w:r>
-              <w:rPr>
-                <w:rFonts w:ascii="Times New Roman" w:hAnsi="Times New Roman" w:cs="Times New Roman"/>
-                <w:color w:val="000000" w:themeColor="text1"/>
-                <w:sz w:val="24"/>
-                <w:szCs w:val="24"/>
-              </w:rPr>
-              <w:t xml:space="preserve">: </w:t>
+              <w:t>Acil durum 10:</w:t>
+            </w:r>
+            <w:r>
+              <w:rPr>
+                <w:rFonts w:ascii="Times New Roman" w:hAnsi="Times New Roman" w:cs="Times New Roman"/>
+                <w:color w:val="000000" w:themeColor="text1"/>
+                <w:sz w:val="24"/>
+                <w:szCs w:val="24"/>
+              </w:rPr>
+              <w:t xml:space="preserve"> </w:t>
             </w:r>
             <w:r>
               <w:rPr>
@@ -15348,7 +15348,7 @@
                 <w:sz w:val="24"/>
                 <w:szCs w:val="24"/>
               </w:rPr>
-              <w:t>Yemeklerden numune alınması</w:t>
+              <w:t>Yemeklerden numune alınması ve 72 saat buzdolabında saklanması</w:t>
             </w:r>
           </w:p>
           <w:p>
@@ -15618,7 +15618,7 @@
                 <w:sz w:val="24"/>
                 <w:szCs w:val="24"/>
               </w:rPr>
-              <w:t>cihazlar koyarak tedbir alınız, olayı Yönetime ve kolluk kuvvetlerine haber veriniz.</w:t>
+              <w:t>cihazlar koyarak tedbir alınız, olayı Yönetime haber veriniz.</w:t>
             </w:r>
           </w:p>
           <w:p>
@@ -15651,7 +15651,7 @@
                 <w:sz w:val="24"/>
                 <w:szCs w:val="24"/>
               </w:rPr>
-              <w:t xml:space="preserve"> Trafik ekibi gelinceye kadar olay yerinden ayrılmayınız ve aracı yerinden oynatmayınız.</w:t>
+              <w:t xml:space="preserve"> Kaza yalnız maddi hasarlıysa araçları trafiği engellemeyecek şekilde yol kenarına çekiniz; taraflar anlaşırsa kaza tespit tutanağı doldurunuz, anlaşma sağlanamazsa 112’yi arayarak kolluk çağırınız.</w:t>
             </w:r>
           </w:p>
           <w:p>
@@ -15741,7 +15741,7 @@
                 <w:sz w:val="24"/>
                 <w:szCs w:val="24"/>
               </w:rPr>
-              <w:t>e 112 Acil Servis’ e ve Yetkili kişiye</w:t>
+              <w:t>e 112 Acil Servis’e ve Yetkili kişiye</w:t>
             </w:r>
             <w:r>
               <w:rPr>
@@ -15799,31 +15799,31 @@
                 <w:sz w:val="24"/>
                 <w:szCs w:val="24"/>
               </w:rPr>
-              <w:t>kazalarında 155 no</w:t>
-            </w:r>
-            <w:r>
-              <w:rPr>
-                <w:rFonts w:ascii="Times New Roman" w:hAnsi="Times New Roman" w:cs="Times New Roman"/>
-                <w:sz w:val="24"/>
-                <w:szCs w:val="24"/>
-              </w:rPr>
-              <w:t>’</w:t>
-            </w:r>
-            <w:r>
-              <w:rPr>
-                <w:rFonts w:ascii="Times New Roman" w:hAnsi="Times New Roman" w:cs="Times New Roman"/>
-                <w:sz w:val="24"/>
-                <w:szCs w:val="24"/>
-              </w:rPr>
-              <w:t>lu telefon aranarak adli kolluk olay mahalline çağrını</w:t>
-            </w:r>
-            <w:r>
-              <w:rPr>
-                <w:rFonts w:ascii="Times New Roman" w:hAnsi="Times New Roman" w:cs="Times New Roman"/>
-                <w:sz w:val="24"/>
-                <w:szCs w:val="24"/>
-              </w:rPr>
-              <w:t xml:space="preserve">z. Trafik ekibi gelinceye kadar </w:t>
+              <w:t>kazalarında 112’yi arayarak kolluğu olay yerine çağırınız.</w:t>
+            </w:r>
+            <w:r>
+              <w:rPr>
+                <w:rFonts w:ascii="Times New Roman" w:hAnsi="Times New Roman" w:cs="Times New Roman"/>
+                <w:sz w:val="24"/>
+                <w:szCs w:val="24"/>
+              </w:rPr>
+              <w:t/>
+            </w:r>
+            <w:r>
+              <w:rPr>
+                <w:rFonts w:ascii="Times New Roman" w:hAnsi="Times New Roman" w:cs="Times New Roman"/>
+                <w:sz w:val="24"/>
+                <w:szCs w:val="24"/>
+              </w:rPr>
+              <w:t/>
+            </w:r>
+            <w:r>
+              <w:rPr>
+                <w:rFonts w:ascii="Times New Roman" w:hAnsi="Times New Roman" w:cs="Times New Roman"/>
+                <w:sz w:val="24"/>
+                <w:szCs w:val="24"/>
+              </w:rPr>
+              <w:t xml:space="preserve"> Trafik ekibi gelinceye kadar </w:t>
             </w:r>
             <w:r>
               <w:rPr>
@@ -16280,7 +16280,7 @@
                 <w:sz w:val="24"/>
                 <w:szCs w:val="24"/>
               </w:rPr>
-              <w:t>Eğer vücudumuzda yanık varsa, hemen soğuk suya tutulmalıdır.</w:t>
+              <w:t>Eğer vücudumuzda yanık varsa, hemen serin, akan suyla soğutulmalıdır.</w:t>
             </w:r>
           </w:p>
           <w:p>
@@ -16540,7 +16540,7 @@
                                       <w:szCs w:val="28"/>
                                     </w:rPr>
                                     <w:br/>
-                                    <w:t>Hızla Akan 15-20 cm Derinlikteki Su Bir İnsanı Sürüklüyebilir.</w:t>
+                                    <w:t>Hızla Akan 15-20 cm Derinlikteki Su Bir İnsanı Sürükleyebilir.</w:t>
                                   </w:r>
                                 </w:p>
                               </w:txbxContent>
@@ -16593,7 +16593,7 @@
                                 <w:szCs w:val="28"/>
                               </w:rPr>
                               <w:br/>
-                              <w:t>Hızla Akan 15-20 cm Derinlikteki Su Bir İnsanı Sürüklüyebilir.</w:t>
+                              <w:t>Hızla Akan 15-20 cm Derinlikteki Su Bir İnsanı Sürükleyebilir.</w:t>
                             </w:r>
                           </w:p>
                         </w:txbxContent>
@@ -17425,7 +17425,7 @@
           </w:p>
           <w:p>
             <w:r>
-              <w:t>Adım atarak çıkamayacağımız yerler olarak tanımlanabilir. Bir insanın denge noktası ikinci bel omurudur. Yani ikinci bel omurunu geçen yerler yüksek olarak kabul edilir. yüksekte çalışma kuralları ve korunma yöntemleri standartlarla belirlenmiştir. Çalışma hayatında ülkeden ülkeye farklılık gösteren yükseklik kavramı Avrupa’da 1.8 m Amerika’da 1.2 m olarak belirlenmiştir. ani bu yükseklikler ve daha üzerinde çalışan personelin mutlaka “Kişisel Koruyucu Donanımları é ile korunması gerekir. Dünyadaki istatistikler 3-4 m üzerinde çalışırken düşen insanların %85’inin hayatını kaybettiğini göstermektedir.</w:t>
+              <w:t>Adım atarak çıkamayacağımız yerler olarak tanımlanabilir. Yüksekte çalışma kuralları ve korunma yöntemleri standartlarla belirlenmiştir. Mevzuatımızda yükseklik için sabit bir sınır yoktur; düşme tehlikesi bulunan her seviye farkı yüksekte çalışma kabul edilir. Bu yerlerde çalışan personel toplu koruma önlemleri veya kişisel koruyucu donanımlarla mutlaka korunmalıdır.</w:t>
             </w:r>
           </w:p>
           <w:p>
@@ -17495,7 +17495,7 @@
               <w:t>İş Güvenliği Kurallarının Teşvik Edilmemesi :</w:t>
             </w:r>
             <w:r>
-              <w:t>Yöneticilerin iş güvenliği kurallarının gerekliğine inanmaması ve bu kuralların uygulanması için personellerini teşvik etmemeleri</w:t>
+              <w:t>Yöneticilerin iş güvenliği kurallarının gerekliliğine inanmaması ve bu kuralların uygulanması için personellerini teşvik etmemeleri</w:t>
             </w:r>
           </w:p>
           <w:p>
@@ -17977,7 +17977,7 @@
           </w:p>
           <w:p>
             <w:r>
-              <w:t>Hangi ekipmanın kullanılacağına karar verirken öncelikle isin içeriği ne zaman biteceği ve nerede kullanılacağı dikkate alınmalıdır. Her çeşit işte merdiven kullanılabilir ancak bunun yerine öncellikle bir çalımsa (uygun şekilde inşa edilmiş hareketli yapı iskelesi veya hareketli çalışma platformu gibi) kullanılması daha güvenlidir. Olukların takılması veya çıkarılması pencerelerin yerleştirilmesi boyama ve yıkım işleri, iskelelerin veya taşınabilir çalışma platformlarının üzerinde gerçekleştirilmektedir.</w:t>
+              <w:t>Hangi ekipmanın kullanılacağına karar verirken öncelikle işin içeriği, ne zaman biteceği ve nerede kullanılacağı dikkate alınmalıdır. Her çeşit işte merdiven kullanılabilir ancak bunun yerine öncelikle bir çalışma platformu (uygun şekilde inşa edilmiş hareketli yapı iskelesi veya hareketli çalışma platformu gibi) kullanılması daha güvenlidir. Olukların takılması veya çıkarılması pencerelerin yerleştirilmesi boyama ve yıkım işleri, iskelelerin veya taşınabilir çalışma platformlarının üzerinde gerçekleştirilmektedir.</w:t>
             </w:r>
           </w:p>
           <w:p>
@@ -18230,13 +18230,13 @@
               <w:spacing w:after="200" w:line="276" w:lineRule="auto"/>
             </w:pPr>
             <w:r>
-              <w:t xml:space="preserve">Merdiven açısı </w:t>
+              <w:t xml:space="preserve">Merdiven açısı 75° olmalıdır (4 m yüksekliğe 1 m ayak mesafesi).</w:t>
             </w:r>
             <w:r>
               <w:rPr>
                 <w:rFonts w:cstheme="minorHAnsi"/>
               </w:rPr>
-              <w:t xml:space="preserve">75 </w:t>
+              <w:t xml:space="preserve"/>
             </w:r>
             <w:r>
               <w:rPr>
@@ -18245,10 +18245,10 @@
                 <w:szCs w:val="21"/>
                 <w:shd w:val="clear" w:color="auto" w:fill="FFFFFF"/>
               </w:rPr>
-              <w:t>° ve</w:t>
-            </w:r>
-            <w:r>
-              <w:t>4 m yüksekliğe 1m merdiven ayağı dayama noktası arası mesafe  olmalıdır.</w:t>
+              <w:t/>
+            </w:r>
+            <w:r>
+              <w:t/>
             </w:r>
           </w:p>
           <w:p>
@@ -18582,7 +18582,7 @@
               <w:spacing w:after="200" w:line="276" w:lineRule="auto"/>
             </w:pPr>
             <w:r>
-              <w:t>Düzenli periyotlarla (haftada 1)  kontrol edilmeli ve bir aksaklık bulunduğu taktirde düzeltilmelidir.</w:t>
+              <w:t>Düzenli periyotlarla (haftada 1)  kontrol edilmeli ve bir aksaklık bulunduğu takdirde düzeltilmelidir.</w:t>
             </w:r>
           </w:p>
           <w:p>
@@ -18654,7 +18654,7 @@
             </w:r>
             <w:r>
               <w:tab/>
-              <w:t>Tavan veya döşemlerdeki boşluk ve deliklere korkuluk yapın veya bu deliklerin üstlerini geçici bir süre için uygun şekilde kapatın.</w:t>
+              <w:t>Tavan veya döşemelerdeki boşluk ve deliklere korkuluk yapın veya bu deliklerin üstlerini geçici bir süre için uygun şekilde kapatın.</w:t>
             </w:r>
           </w:p>
           <w:p>
@@ -18792,7 +18792,7 @@
               <w:spacing w:after="200" w:line="276" w:lineRule="auto"/>
             </w:pPr>
             <w:r>
-              <w:t>Emniyet kemeri platformun zeminine bağlanmalı, personelin korkuluklara çıkması sağlanmalıdır.</w:t>
+              <w:t>Emniyet kemeri platformun zeminine bağlanmalı, personelin korkuluklara çıkması engellenmelidir.</w:t>
             </w:r>
           </w:p>
           <w:p>
@@ -18831,7 +18831,7 @@
               <w:spacing w:after="200" w:line="276" w:lineRule="auto"/>
             </w:pPr>
             <w:r>
-              <w:t>Rüzgar hızının 45 km/saat olduğu durumlarda yüksekte çalışma yapılmaz.</w:t>
+              <w:t>Rüzgâr hızının 45 km/saate ulaştığı durumlarda yüksekte çalışma yapılmaz.</w:t>
             </w:r>
           </w:p>
           <w:p>
@@ -19024,7 +19024,7 @@
               <w:spacing w:after="200" w:line="276" w:lineRule="auto"/>
             </w:pPr>
             <w:r>
-              <w:t>Toplu koruma önlemleri olarak 1.25 cm yükseklikte ve en az 125 kN darbeye dayanabilecek güvenlik korkulukları veya güvenlik ağları kullanılabilir.</w:t>
+              <w:t>Toplu koruma önlemleri olarak ara korkuluğu ve topuk levhası bulunan, yeterli dayanımda güvenlik korkulukları veya güvenlik ağları kullanılabilir.</w:t>
             </w:r>
           </w:p>
           <w:p>
@@ -19121,10 +19121,10 @@
               <w:t>Tavan veya dö</w:t>
             </w:r>
             <w:r>
-              <w:t>şemelerdeki boşluk ve deliklere</w:t>
-            </w:r>
-            <w:r>
-              <w:t>,asansör boşluklarına korkuluk yapılacak veya bu deliklerin üstleri geçici bir süre için uygun şekilde güvenlik ağları ile kapatılacaktır.</w:t>
+              <w:t>şemelerdeki boşluk ve deliklere, asansör</w:t>
+            </w:r>
+            <w:r>
+              <w:t> boşluklarına korkuluk yapılacak veya bu deliklerin üstleri geçici bir süre için uygun şekilde güvenlik ağları ile kapatılacaktır.</w:t>
             </w:r>
           </w:p>
           <w:p>
@@ -19257,13 +19257,13 @@
           </w:p>
           <w:p>
             <w:r>
-              <w:t>Yatay yaşam hattında olduğu gibi dikey yaşam hatlarında da düşme riski bulanan çalışma alanlarında uygulanan sistemdir. Dikey Yaşam Hatları EN 353-1:2014 standardına uygun olmalıdır. Dikey yaşam hatları genellikler mer</w:t>
-            </w:r>
-            <w:r>
-              <w:t>divenlerde uygulanmaktadır. .</w:t>
-            </w:r>
-            <w:r>
-              <w:t>Sistem parçaları paslanmaz çelikten imal edilmelidir.</w:t>
+              <w:t>Yatay yaşam hattında olduğu gibi dikey yaşam hatlarında da düşme riski bulunan çalışma alanlarında uygulanan sistemdir. Dikey Yaşam Hatları EN 353-1:2014 standardına uygun olmalıdır. Dikey yaşam hatları genellikle merdivenlerde uygulanmaktadır. Sistem</w:t>
+            </w:r>
+            <w:r>
+              <w:t/>
+            </w:r>
+            <w:r>
+              <w:t> parçaları paslanmaz çelikten imal edilmelidir.</w:t>
             </w:r>
           </w:p>
           <w:p>
@@ -19618,7 +19618,7 @@
                 <w:rFonts w:eastAsia="ArialMT" w:cstheme="minorHAnsi"/>
                 <w:color w:val="2B2A29"/>
               </w:rPr>
-              <w:t>Teknik malzemeleri kullana bilme yetkinliği olmalı</w:t>
+              <w:t>Teknik malzemeleri kullanabilme yetkinliği olmalı</w:t>
             </w:r>
           </w:p>
           <w:p>
@@ -19748,7 +19748,7 @@
                 <w:rFonts w:eastAsia="ArialMT" w:cstheme="minorHAnsi"/>
                 <w:color w:val="2B2A29"/>
               </w:rPr>
-              <w:t>Lanyartla çalışma yaparken askıda kalan personelin kurtarılmasında, kurtarma personeli personelin baş hizasına ankaraj noktası oluşturur.</w:t>
+              <w:t>Lanyartla çalışma yaparken askıda kalan personelin kurtarılmasında, kurtarma personeli personelin baş hizasına ankraj noktası oluşturur.</w:t>
             </w:r>
           </w:p>
           <w:p>
@@ -19773,7 +19773,7 @@
                 <w:rFonts w:eastAsia="ArialMT" w:cstheme="minorHAnsi"/>
                 <w:color w:val="2B2A29"/>
               </w:rPr>
-              <w:t>Kurtarma kaldırma cihazını bu noktaya ankare eder. Lanyartlardan askıda kalmış personeli, lanyartlardan kurtarmak için kurtarma cihazını kaldırma konumuna getirir.</w:t>
+              <w:t>Kurtarma kaldırma cihazını bu noktaya bağlar. Lanyartlardan askıda kalmış personeli, lanyartlardan kurtarmak için kurtarma cihazını kaldırma konumuna getirir.</w:t>
             </w:r>
           </w:p>
           <w:p>
@@ -19848,7 +19848,7 @@
                 <w:rFonts w:eastAsia="ArialMT" w:cstheme="minorHAnsi"/>
                 <w:color w:val="2B2A29"/>
               </w:rPr>
-              <w:t>Kurtarma cihazını indirme konumuna alıp 9 m/sn hızla kişinin aşağı tahliyesini sağlar.</w:t>
+              <w:t>Kurtarma cihazını indirme konumuna alıp üreticinin belirlediği kontrollü hızla kişinin aşağı tahliyesini sağlar.</w:t>
             </w:r>
           </w:p>
           <w:p>
@@ -19987,7 +19987,7 @@
                 <w:rFonts w:eastAsia="ArialMT" w:cstheme="minorHAnsi"/>
                 <w:color w:val="2B2A29"/>
               </w:rPr>
-              <w:t>, uzun süreli devinimsiz asılma sendromu veya basitçe iniş sonrası bayılma olarak adlandırılan durum, olasılıkla yaralanmalara ve hatta hemen ele alınmazsa ölümlere dahi neden olmaktadır. Bu durum karşısında askıda kalan personelin emniyet kemeri hemen çıkarılamamalıdır.</w:t>
+              <w:t>, uzun süreli devinimsiz asılma sendromu veya basitçe iniş sonrası bayılma olarak adlandırılan durum, olasılıkla yaralanmalara ve hatta hemen ele alınmazsa ölümlere dahi neden olmaktadır. Bu durum karşısında askıda kalan personelin emniyet kemeri hemen çıkarılmamalıdır.</w:t>
             </w:r>
           </w:p>
           <w:p>
@@ -20011,13 +20011,13 @@
                 <w:rFonts w:eastAsia="ArialMT" w:cstheme="minorHAnsi"/>
                 <w:color w:val="2B2A29"/>
               </w:rPr>
-              <w:t xml:space="preserve">Askıda kalan çalışan indirilip, sırt üstü yatırılmalı ve kan dolaşımının düzenli hale gelmesi için doğru şekilde masaj yapılmalıdır. Emniyet kemerinin </w:t>
+              <w:t xml:space="preserve">Askıda kalan çalışan indirilip, sırt üstü yatırılmalı, emniyet kemerinin bacak kayışları gevşetilmeli ve 112’ye haber verilmelidir.</w:t>
             </w:r>
             <w:r>
               <w:rPr>
                 <w:rFonts w:eastAsia="ArialMT" w:cstheme="minorHAnsi"/>
               </w:rPr>
-              <w:t>ayak kolonları belirli zaman aralıklarında gevşetilmelidir.</w:t>
+              <w:t/>
             </w:r>
           </w:p>
           <w:p>
@@ -20041,14 +20041,14 @@
               <w:rPr>
                 <w:rFonts w:eastAsia="ArialMT" w:cstheme="minorHAnsi"/>
               </w:rPr>
-              <w:t>Askıda kalan personele 10 ile 25 dakika içerisinde müdahale edilmesi gerekir</w:t>
+              <w:t>Askıda kalan personele 10 dakika içerisinde müdahale edilmesi gerekir.</w:t>
             </w:r>
             <w:r>
               <w:rPr>
                 <w:rFonts w:eastAsia="ArialMT" w:cstheme="minorHAnsi"/>
                 <w:color w:val="2B2A29"/>
               </w:rPr>
-              <w:t>.</w:t>
+              <w:t/>
             </w:r>
           </w:p>
           <w:p>
@@ -25552,7 +25552,7 @@
                                     <w:rPr>
                                       <w:rFonts w:ascii="Arial TUR" w:hAnsi="Arial TUR" w:cs="Arial TUR"/>
                                     </w:rPr>
-                                    <w:t>ALO 112- 155</w:t>
+                                    <w:t>ALO 112</w:t>
                                   </w:r>
                                 </w:p>
                               </w:txbxContent>
@@ -25588,7 +25588,7 @@
                               <w:rPr>
                                 <w:rFonts w:ascii="Arial TUR" w:hAnsi="Arial TUR" w:cs="Arial TUR"/>
                               </w:rPr>
-                              <w:t>ALO 112- 155</w:t>
+                              <w:t>ALO 112</w:t>
                             </w:r>
                           </w:p>
                         </w:txbxContent>
@@ -27016,7 +27016,7 @@
                       <w:sz w:val="20"/>
                       <w:szCs w:val="20"/>
                     </w:rPr>
-                    <w:t>155</w:t>
+                    <w:t>112</w:t>
                   </w:r>
                   <w:r>
                     <w:rPr>
@@ -27026,7 +27026,7 @@
                       <w:sz w:val="20"/>
                       <w:szCs w:val="20"/>
                     </w:rPr>
-                    <w:t>–</w:t>
+                    <w:t/>
                   </w:r>
                   <w:r>
                     <w:rPr>
@@ -27036,7 +27036,7 @@
                       <w:sz w:val="20"/>
                       <w:szCs w:val="20"/>
                     </w:rPr>
-                    <w:t>156</w:t>
+                    <w:t/>
                   </w:r>
                 </w:p>
               </w:tc>
@@ -27803,7 +27803,7 @@
                       <w:sz w:val="20"/>
                       <w:szCs w:val="20"/>
                     </w:rPr>
-                    <w:t>BURSA SU İDARESİ</w:t>
+                    <w:t>SU İDARESİ</w:t>
                   </w:r>
                 </w:p>
               </w:tc>

</xml_diff>

<commit_message>
ADEP santiye: korkuluk yukseklikleri 1,2 m, ankraj noktasi, yasam hatti, tekrar ve kosullu EK-1 atfi
Korkuluk 120/125 cm ve "yeterli yukseklik" ifadeleri en az 1,2 m yapildi
(santiye profili + Klasik Word sablonu). "Zemine baglar" yerine uygun ankraj
noktasi / ureticinin baglanti noktasi. Yasam hatti kisi sayisi ureticiye gore.
Onlemler paragrafindaki EK-1 Yuksekten Dusme atfi yalniz o konu seciliyse basilir.

Co-Authored-By: Claude Opus 5.5 <noreply@anthropic.com>
</commit_message>
<xml_diff>
--- a/resources/belge/acil-durum-plani-sablonu.docx
+++ b/resources/belge/acil-durum-plani-sablonu.docx
@@ -12388,7 +12388,7 @@
                 <w:sz w:val="24"/>
                 <w:szCs w:val="24"/>
               </w:rPr>
-              <w:t xml:space="preserve">Yüksekte çalışma platformu ve iskelelerde çalışma esnasında çalışma yapan personel kendisini çalışma yapılan zemine bağlamalıdır. </w:t>
+              <w:t xml:space="preserve">Yüksekte çalışma platformu ve iskelelerde çalışma esnasında çalışma yapan personel kendisini taşıma gücü uygun bir ankraj noktasına, mümkünse omuz hizasının üstüne bağlamalıdır; manlift ve hareketli platformda üreticinin belirlediği bağlantı noktası kullanılmalıdır. </w:t>
             </w:r>
           </w:p>
           <w:p>
@@ -12539,7 +12539,7 @@
                 <w:sz w:val="24"/>
                 <w:szCs w:val="24"/>
               </w:rPr>
-              <w:t>Sepetin kapısı içeri doğru açılmalı, korkuluk yükseklikleri 120 cm olmalı ve üreticinin belirttiği dayanımda olmalıdır.</w:t>
+              <w:t>Sepetin kapısı içeri doğru açılmalı, korkuluk yükseklikleri en az 1,2 m olmalı ve üreticinin belirttiği dayanımda olmalıdır.</w:t>
             </w:r>
           </w:p>
           <w:p>
@@ -18618,7 +18618,7 @@
             </w:r>
             <w:r>
               <w:tab/>
-              <w:t>Yüksekten düşmeler özellikle yeterli yükseklikte sağlam korkuluklarla veya aynı korumayı sağlayabilen başka yollarla önlenecektir. Korkuluklarda en az bir trabzan orta seviyesinde bir ara korkuluk ve tabanında eteklik olmasına dikkat edin.</w:t>
+              <w:t>Yüksekten düşmeler özellikle en az 1,2 m yüksekliğinde sağlam korkuluklarla veya aynı korumayı sağlayabilen başka yollarla önlenecektir. Korkuluklarda en az bir trabzan orta seviyesinde bir ara korkuluk ve tabanında eteklik olmasına dikkat edin.</w:t>
             </w:r>
           </w:p>
           <w:p>
@@ -18792,7 +18792,7 @@
               <w:spacing w:after="200" w:line="276" w:lineRule="auto"/>
             </w:pPr>
             <w:r>
-              <w:t>Emniyet kemeri platformun zeminine bağlanmalı, personelin korkuluklara çıkması engellenmelidir.</w:t>
+              <w:t>Emniyet kemeri platformda üreticinin belirlediği bağlantı noktasına bağlanmalı, personelin korkuluklara çıkması engellenmelidir.</w:t>
             </w:r>
           </w:p>
           <w:p>
@@ -18805,7 +18805,7 @@
               <w:spacing w:after="200" w:line="276" w:lineRule="auto"/>
             </w:pPr>
             <w:r>
-              <w:t>Platform korkulukları en az 125 cm yükseklikte olmalıdır.</w:t>
+              <w:t>Platform korkulukları en az 1,2 m yükseklikte olmalıdır.</w:t>
             </w:r>
           </w:p>
           <w:p>
@@ -19024,7 +19024,7 @@
               <w:spacing w:after="200" w:line="276" w:lineRule="auto"/>
             </w:pPr>
             <w:r>
-              <w:t>Toplu koruma önlemleri olarak ara korkuluğu ve topuk levhası bulunan, yeterli dayanımda güvenlik korkulukları veya güvenlik ağları kullanılabilir.</w:t>
+              <w:t>Toplu koruma önlemleri olarak ara korkuluğu ve topuk levhası bulunan, yeterli dayanımda, en az 1,2 m yüksekliğinde güvenlik korkulukları veya güvenlik ağları kullanılabilir.</w:t>
             </w:r>
           </w:p>
           <w:p>

</xml_diff>